<commit_message>
BSC mods to include the simulated time of events
Former-commit-id: fbb4077a597efc47c202d676b21de5d90df39115
</commit_message>
<xml_diff>
--- a/util/load_balancing/balancing_documentation.docx
+++ b/util/load_balancing/balancing_documentation.docx
@@ -3162,16 +3162,102 @@
         </w:rPr>
         <w:t>)</w:t>
       </w:r>
-      <w:r>
-        <w:rPr>
-          <w:rFonts w:ascii="Courier" w:hAnsi="Courier" w:cs="Arial"/>
+    </w:p>
+    <w:p>
+      <w:pPr>
+        <w:pStyle w:val="western"/>
+        <w:numPr>
+          <w:ilvl w:val="0"/>
+          <w:numId w:val="29"/>
+        </w:numPr>
+        <w:spacing w:after="0"/>
+        <w:rPr>
+          <w:lang w:val="en-US"/>
+        </w:rPr>
+      </w:pPr>
+      <w:r>
+        <w:rPr>
+          <w:lang w:val="en-US"/>
+        </w:rPr>
+        <w:t xml:space="preserve">the simulated in the component calling the OASIS3-MCT API routine (2nd argument of </w:t>
+      </w:r>
+      <w:proofErr w:type="spellStart"/>
+      <w:r>
+        <w:rPr>
+          <w:rFonts w:ascii="Courier" w:hAnsi="Courier" w:cs="Courier New"/>
+          <w:lang w:val="en-US"/>
+        </w:rPr>
+        <w:t>oasis_get</w:t>
+      </w:r>
+      <w:proofErr w:type="spellEnd"/>
+      <w:r>
+        <w:rPr>
+          <w:lang w:val="en-US"/>
+        </w:rPr>
+        <w:t xml:space="preserve"> or </w:t>
+      </w:r>
+      <w:proofErr w:type="spellStart"/>
+      <w:r>
+        <w:rPr>
+          <w:rFonts w:ascii="Courier" w:hAnsi="Courier" w:cs="Courier New"/>
+          <w:lang w:val="en-US"/>
+        </w:rPr>
+        <w:t>oasis_put</w:t>
+      </w:r>
+      <w:proofErr w:type="spellEnd"/>
+      <w:r>
+        <w:rPr>
+          <w:lang w:val="en-US"/>
+        </w:rPr>
+        <w:t xml:space="preserve"> call)</w:t>
+      </w:r>
+      <w:r>
+        <w:rPr>
+          <w:lang w:val="en-US"/>
+        </w:rPr>
+        <w:t xml:space="preserve">, </w:t>
+      </w:r>
+      <w:proofErr w:type="spellStart"/>
+      <w:r>
+        <w:rPr>
+          <w:rFonts w:ascii="Courier" w:hAnsi="Courier" w:cs="Courier New"/>
+          <w:lang w:val="en-US"/>
+        </w:rPr>
+        <w:t>tsid</w:t>
+      </w:r>
+      <w:proofErr w:type="spellEnd"/>
+      <w:r>
+        <w:rPr>
+          <w:rFonts w:ascii="Courier" w:hAnsi="Courier" w:cs="Courier New"/>
+          <w:lang w:val="en-US"/>
+        </w:rPr>
+        <w:t>(</w:t>
+      </w:r>
+      <w:proofErr w:type="spellStart"/>
+      <w:r>
+        <w:rPr>
+          <w:rFonts w:ascii="Courier" w:hAnsi="Courier" w:cs="Courier New"/>
+          <w:lang w:val="en-US"/>
+        </w:rPr>
+        <w:t>nx</w:t>
+      </w:r>
+      <w:proofErr w:type="spellEnd"/>
+      <w:r>
+        <w:rPr>
+          <w:rFonts w:ascii="Courier" w:hAnsi="Courier" w:cs="Courier New"/>
+          <w:lang w:val="en-US"/>
+        </w:rPr>
+        <w:t>)</w:t>
+      </w:r>
+      <w:r>
+        <w:rPr>
+          <w:rFonts w:ascii="Courier" w:hAnsi="Courier" w:cs="Courier New"/>
           <w:lang w:val="en-US"/>
         </w:rPr>
         <w:t>.</w:t>
       </w:r>
       <w:r>
         <w:rPr>
-          <w:rFonts w:ascii="Arial" w:hAnsi="Arial" w:cs="Arial"/>
           <w:lang w:val="en-US"/>
         </w:rPr>
         <w:t xml:space="preserve"> </w:t>
@@ -7440,25 +7526,7 @@
           <w:szCs w:val="22"/>
           <w:lang w:val="en-GB"/>
         </w:rPr>
-        <w:t>)</w:t>
-      </w:r>
-      <w:r>
-        <w:rPr>
-          <w:rFonts w:ascii="Courier" w:eastAsia="Times New Roman" w:hAnsi="Courier" w:cs="Times New Roman"/>
-          <w:sz w:val="22"/>
-          <w:szCs w:val="22"/>
-          <w:lang w:val="en-GB"/>
-        </w:rPr>
-        <w:t xml:space="preserve"> </w:t>
-      </w:r>
-      <w:r>
-        <w:rPr>
-          <w:rFonts w:ascii="Courier" w:eastAsia="Times New Roman" w:hAnsi="Courier" w:cs="Times New Roman"/>
-          <w:sz w:val="22"/>
-          <w:szCs w:val="22"/>
-          <w:lang w:val="en-GB"/>
-        </w:rPr>
-        <w:t>:</w:t>
+        <w:t>) :</w:t>
       </w:r>
       <w:proofErr w:type="gramEnd"/>
       <w:r>
@@ -8297,6 +8365,8 @@
       </w:r>
     </w:p>
     <w:sectPr>
+      <w:footerReference w:type="even" r:id="rId15"/>
+      <w:footerReference w:type="default" r:id="rId16"/>
       <w:pgSz w:w="11900" w:h="16840"/>
       <w:pgMar w:top="1417" w:right="1417" w:bottom="1417" w:left="1417" w:header="708" w:footer="708" w:gutter="0"/>
       <w:cols w:space="708"/>
@@ -8325,6 +8395,123 @@
 </w:endnotes>
 </file>
 
+<file path=word/footer1.xml><?xml version="1.0" encoding="utf-8"?>
+<w:ftr xmlns:wpc="http://schemas.microsoft.com/office/word/2010/wordprocessingCanvas" xmlns:cx="http://schemas.microsoft.com/office/drawing/2014/chartex" xmlns:cx1="http://schemas.microsoft.com/office/drawing/2015/9/8/chartex" xmlns:cx2="http://schemas.microsoft.com/office/drawing/2015/10/21/chartex" xmlns:cx3="http://schemas.microsoft.com/office/drawing/2016/5/9/chartex" xmlns:cx4="http://schemas.microsoft.com/office/drawing/2016/5/10/chartex" xmlns:cx5="http://schemas.microsoft.com/office/drawing/2016/5/11/chartex" xmlns:cx6="http://schemas.microsoft.com/office/drawing/2016/5/12/chartex" xmlns:cx7="http://schemas.microsoft.com/office/drawing/2016/5/13/chartex" xmlns:cx8="http://schemas.microsoft.com/office/drawing/2016/5/14/chartex" xmlns:mc="http://schemas.openxmlformats.org/markup-compatibility/2006" xmlns:aink="http://schemas.microsoft.com/office/drawing/2016/ink" xmlns:am3d="http://schemas.microsoft.com/office/drawing/2017/model3d" xmlns:o="urn:schemas-microsoft-com:office:office" xmlns:r="http://schemas.openxmlformats.org/officeDocument/2006/relationships" xmlns:m="http://schemas.openxmlformats.org/officeDocument/2006/math" xmlns:v="urn:schemas-microsoft-com:vml" xmlns:wp14="http://schemas.microsoft.com/office/word/2010/wordprocessingDrawing" xmlns:wp="http://schemas.openxmlformats.org/drawingml/2006/wordprocessingDrawing" xmlns:w10="urn:schemas-microsoft-com:office:word" xmlns:w="http://schemas.openxmlformats.org/wordprocessingml/2006/main" xmlns:w14="http://schemas.microsoft.com/office/word/2010/wordml" xmlns:w15="http://schemas.microsoft.com/office/word/2012/wordml" xmlns:w16cex="http://schemas.microsoft.com/office/word/2018/wordml/cex" xmlns:w16cid="http://schemas.microsoft.com/office/word/2016/wordml/cid" xmlns:w16="http://schemas.microsoft.com/office/word/2018/wordml" xmlns:w16sdtdh="http://schemas.microsoft.com/office/word/2020/wordml/sdtdatahash" xmlns:w16se="http://schemas.microsoft.com/office/word/2015/wordml/symex" xmlns:wpg="http://schemas.microsoft.com/office/word/2010/wordprocessingGroup" xmlns:wpi="http://schemas.microsoft.com/office/word/2010/wordprocessingInk" xmlns:wne="http://schemas.microsoft.com/office/word/2006/wordml" xmlns:wps="http://schemas.microsoft.com/office/word/2010/wordprocessingShape" mc:Ignorable="w14 w15 w16se w16cid w16 w16cex w16sdtdh wp14">
+  <w:sdt>
+    <w:sdtPr>
+      <w:rPr>
+        <w:rStyle w:val="PageNumber"/>
+      </w:rPr>
+      <w:id w:val="1693193573"/>
+      <w:docPartObj>
+        <w:docPartGallery w:val="Page Numbers (Bottom of Page)"/>
+        <w:docPartUnique/>
+      </w:docPartObj>
+    </w:sdtPr>
+    <w:sdtContent>
+      <w:p>
+        <w:pPr>
+          <w:pStyle w:val="Footer"/>
+          <w:framePr w:wrap="none" w:vAnchor="text" w:hAnchor="margin" w:xAlign="right" w:y="1"/>
+          <w:rPr>
+            <w:rStyle w:val="PageNumber"/>
+          </w:rPr>
+        </w:pPr>
+        <w:r>
+          <w:rPr>
+            <w:rStyle w:val="PageNumber"/>
+          </w:rPr>
+          <w:fldChar w:fldCharType="begin"/>
+        </w:r>
+        <w:r>
+          <w:rPr>
+            <w:rStyle w:val="PageNumber"/>
+          </w:rPr>
+          <w:instrText xml:space="preserve"> PAGE </w:instrText>
+        </w:r>
+        <w:r>
+          <w:rPr>
+            <w:rStyle w:val="PageNumber"/>
+          </w:rPr>
+          <w:fldChar w:fldCharType="end"/>
+        </w:r>
+      </w:p>
+    </w:sdtContent>
+  </w:sdt>
+  <w:p>
+    <w:pPr>
+      <w:pStyle w:val="Footer"/>
+      <w:ind w:right="360"/>
+    </w:pPr>
+  </w:p>
+</w:ftr>
+</file>
+
+<file path=word/footer2.xml><?xml version="1.0" encoding="utf-8"?>
+<w:ftr xmlns:wpc="http://schemas.microsoft.com/office/word/2010/wordprocessingCanvas" xmlns:cx="http://schemas.microsoft.com/office/drawing/2014/chartex" xmlns:cx1="http://schemas.microsoft.com/office/drawing/2015/9/8/chartex" xmlns:cx2="http://schemas.microsoft.com/office/drawing/2015/10/21/chartex" xmlns:cx3="http://schemas.microsoft.com/office/drawing/2016/5/9/chartex" xmlns:cx4="http://schemas.microsoft.com/office/drawing/2016/5/10/chartex" xmlns:cx5="http://schemas.microsoft.com/office/drawing/2016/5/11/chartex" xmlns:cx6="http://schemas.microsoft.com/office/drawing/2016/5/12/chartex" xmlns:cx7="http://schemas.microsoft.com/office/drawing/2016/5/13/chartex" xmlns:cx8="http://schemas.microsoft.com/office/drawing/2016/5/14/chartex" xmlns:mc="http://schemas.openxmlformats.org/markup-compatibility/2006" xmlns:aink="http://schemas.microsoft.com/office/drawing/2016/ink" xmlns:am3d="http://schemas.microsoft.com/office/drawing/2017/model3d" xmlns:o="urn:schemas-microsoft-com:office:office" xmlns:r="http://schemas.openxmlformats.org/officeDocument/2006/relationships" xmlns:m="http://schemas.openxmlformats.org/officeDocument/2006/math" xmlns:v="urn:schemas-microsoft-com:vml" xmlns:wp14="http://schemas.microsoft.com/office/word/2010/wordprocessingDrawing" xmlns:wp="http://schemas.openxmlformats.org/drawingml/2006/wordprocessingDrawing" xmlns:w10="urn:schemas-microsoft-com:office:word" xmlns:w="http://schemas.openxmlformats.org/wordprocessingml/2006/main" xmlns:w14="http://schemas.microsoft.com/office/word/2010/wordml" xmlns:w15="http://schemas.microsoft.com/office/word/2012/wordml" xmlns:w16cex="http://schemas.microsoft.com/office/word/2018/wordml/cex" xmlns:w16cid="http://schemas.microsoft.com/office/word/2016/wordml/cid" xmlns:w16="http://schemas.microsoft.com/office/word/2018/wordml" xmlns:w16sdtdh="http://schemas.microsoft.com/office/word/2020/wordml/sdtdatahash" xmlns:w16se="http://schemas.microsoft.com/office/word/2015/wordml/symex" xmlns:wpg="http://schemas.microsoft.com/office/word/2010/wordprocessingGroup" xmlns:wpi="http://schemas.microsoft.com/office/word/2010/wordprocessingInk" xmlns:wne="http://schemas.microsoft.com/office/word/2006/wordml" xmlns:wps="http://schemas.microsoft.com/office/word/2010/wordprocessingShape" mc:Ignorable="w14 w15 w16se w16cid w16 w16cex w16sdtdh wp14">
+  <w:sdt>
+    <w:sdtPr>
+      <w:rPr>
+        <w:rStyle w:val="PageNumber"/>
+      </w:rPr>
+      <w:id w:val="-1530021953"/>
+      <w:docPartObj>
+        <w:docPartGallery w:val="Page Numbers (Bottom of Page)"/>
+        <w:docPartUnique/>
+      </w:docPartObj>
+    </w:sdtPr>
+    <w:sdtContent>
+      <w:p>
+        <w:pPr>
+          <w:pStyle w:val="Footer"/>
+          <w:framePr w:wrap="none" w:vAnchor="text" w:hAnchor="margin" w:xAlign="right" w:y="1"/>
+          <w:rPr>
+            <w:rStyle w:val="PageNumber"/>
+          </w:rPr>
+        </w:pPr>
+        <w:r>
+          <w:rPr>
+            <w:rStyle w:val="PageNumber"/>
+          </w:rPr>
+          <w:fldChar w:fldCharType="begin"/>
+        </w:r>
+        <w:r>
+          <w:rPr>
+            <w:rStyle w:val="PageNumber"/>
+          </w:rPr>
+          <w:instrText xml:space="preserve"> PAGE </w:instrText>
+        </w:r>
+        <w:r>
+          <w:rPr>
+            <w:rStyle w:val="PageNumber"/>
+          </w:rPr>
+          <w:fldChar w:fldCharType="separate"/>
+        </w:r>
+        <w:r>
+          <w:rPr>
+            <w:rStyle w:val="PageNumber"/>
+            <w:noProof/>
+          </w:rPr>
+          <w:t>1</w:t>
+        </w:r>
+        <w:r>
+          <w:rPr>
+            <w:rStyle w:val="PageNumber"/>
+          </w:rPr>
+          <w:fldChar w:fldCharType="end"/>
+        </w:r>
+      </w:p>
+    </w:sdtContent>
+  </w:sdt>
+  <w:p>
+    <w:pPr>
+      <w:pStyle w:val="Footer"/>
+      <w:ind w:right="360"/>
+    </w:pPr>
+  </w:p>
+</w:ftr>
+</file>
+
 <file path=word/footnotes.xml><?xml version="1.0" encoding="utf-8"?>
 <w:footnotes xmlns:wpc="http://schemas.microsoft.com/office/word/2010/wordprocessingCanvas" xmlns:cx="http://schemas.microsoft.com/office/drawing/2014/chartex" xmlns:cx1="http://schemas.microsoft.com/office/drawing/2015/9/8/chartex" xmlns:cx2="http://schemas.microsoft.com/office/drawing/2015/10/21/chartex" xmlns:cx3="http://schemas.microsoft.com/office/drawing/2016/5/9/chartex" xmlns:cx4="http://schemas.microsoft.com/office/drawing/2016/5/10/chartex" xmlns:cx5="http://schemas.microsoft.com/office/drawing/2016/5/11/chartex" xmlns:cx6="http://schemas.microsoft.com/office/drawing/2016/5/12/chartex" xmlns:cx7="http://schemas.microsoft.com/office/drawing/2016/5/13/chartex" xmlns:cx8="http://schemas.microsoft.com/office/drawing/2016/5/14/chartex" xmlns:mc="http://schemas.openxmlformats.org/markup-compatibility/2006" xmlns:aink="http://schemas.microsoft.com/office/drawing/2016/ink" xmlns:am3d="http://schemas.microsoft.com/office/drawing/2017/model3d" xmlns:o="urn:schemas-microsoft-com:office:office" xmlns:r="http://schemas.openxmlformats.org/officeDocument/2006/relationships" xmlns:m="http://schemas.openxmlformats.org/officeDocument/2006/math" xmlns:v="urn:schemas-microsoft-com:vml" xmlns:wp14="http://schemas.microsoft.com/office/word/2010/wordprocessingDrawing" xmlns:wp="http://schemas.openxmlformats.org/drawingml/2006/wordprocessingDrawing" xmlns:w10="urn:schemas-microsoft-com:office:word" xmlns:w="http://schemas.openxmlformats.org/wordprocessingml/2006/main" xmlns:w14="http://schemas.microsoft.com/office/word/2010/wordml" xmlns:w15="http://schemas.microsoft.com/office/word/2012/wordml" xmlns:w16cex="http://schemas.microsoft.com/office/word/2018/wordml/cex" xmlns:w16cid="http://schemas.microsoft.com/office/word/2016/wordml/cid" xmlns:w16="http://schemas.microsoft.com/office/word/2018/wordml" xmlns:w16sdtdh="http://schemas.microsoft.com/office/word/2020/wordml/sdtdatahash" xmlns:w16se="http://schemas.microsoft.com/office/word/2015/wordml/symex" xmlns:wpg="http://schemas.microsoft.com/office/word/2010/wordprocessingGroup" xmlns:wpi="http://schemas.microsoft.com/office/word/2010/wordprocessingInk" xmlns:wne="http://schemas.microsoft.com/office/word/2006/wordml" xmlns:wps="http://schemas.microsoft.com/office/word/2010/wordprocessingShape" mc:Ignorable="w14 w15 w16se w16cid w16 w16cex w16sdtdh wp14">
   <w:footnote w:type="separator" w:id="-1">
@@ -8507,25 +8694,7 @@
           <w:szCs w:val="22"/>
           <w:lang w:val="en-US" w:eastAsia="en-GB"/>
         </w:rPr>
-        <w:t>T</w:t>
-      </w:r>
-      <w:r>
-        <w:rPr>
-          <w:rFonts w:ascii="Times New Roman" w:eastAsia="Times New Roman" w:hAnsi="Times New Roman" w:cs="Times New Roman"/>
-          <w:sz w:val="22"/>
-          <w:szCs w:val="22"/>
-          <w:lang w:val="en-US" w:eastAsia="en-GB"/>
-        </w:rPr>
-        <w:t>he first and the last coupling time steps</w:t>
-      </w:r>
-      <w:r>
-        <w:rPr>
-          <w:rFonts w:ascii="Times New Roman" w:eastAsia="Times New Roman" w:hAnsi="Times New Roman" w:cs="Times New Roman"/>
-          <w:sz w:val="22"/>
-          <w:szCs w:val="22"/>
-          <w:lang w:val="en-US" w:eastAsia="en-GB"/>
-        </w:rPr>
-        <w:t xml:space="preserve"> are excluded from the total loop time as these time steps often involve specific operations, like restart writing or reading; including them would distort the extrapolation of the time needed for longer simulations.</w:t>
+        <w:t>The first and the last coupling time steps are excluded from the total loop time as these time steps often involve specific operations, like restart writing or reading; including them would distort the extrapolation of the time needed for longer simulations.</w:t>
       </w:r>
       <w:r>
         <w:rPr>
@@ -13482,6 +13651,7 @@
   <w:style w:type="character" w:default="1" w:styleId="DefaultParagraphFont">
     <w:name w:val="Default Paragraph Font"/>
     <w:uiPriority w:val="1"/>
+    <w:semiHidden/>
     <w:unhideWhenUsed/>
   </w:style>
   <w:style w:type="table" w:default="1" w:styleId="TableNormal">
@@ -13811,6 +13981,35 @@
       <w:ind w:left="480"/>
     </w:pPr>
   </w:style>
+  <w:style w:type="paragraph" w:styleId="Footer">
+    <w:name w:val="footer"/>
+    <w:basedOn w:val="Normal"/>
+    <w:link w:val="FooterChar"/>
+    <w:uiPriority w:val="99"/>
+    <w:unhideWhenUsed/>
+    <w:rsid w:val="0090040B"/>
+    <w:pPr>
+      <w:tabs>
+        <w:tab w:val="center" w:pos="4513"/>
+        <w:tab w:val="right" w:pos="9026"/>
+      </w:tabs>
+    </w:pPr>
+  </w:style>
+  <w:style w:type="character" w:customStyle="1" w:styleId="FooterChar">
+    <w:name w:val="Footer Char"/>
+    <w:basedOn w:val="DefaultParagraphFont"/>
+    <w:link w:val="Footer"/>
+    <w:uiPriority w:val="99"/>
+    <w:rsid w:val="0090040B"/>
+  </w:style>
+  <w:style w:type="character" w:styleId="PageNumber">
+    <w:name w:val="page number"/>
+    <w:basedOn w:val="DefaultParagraphFont"/>
+    <w:uiPriority w:val="99"/>
+    <w:semiHidden/>
+    <w:unhideWhenUsed/>
+    <w:rsid w:val="0090040B"/>
+  </w:style>
 </w:styles>
 </file>
 

</xml_diff>